<commit_message>
feat: implement core backend services for LLM orchestration, RAG, and goal tracking
</commit_message>
<xml_diff>
--- a/Design Docs/Core Features Doc.docx
+++ b/Design Docs/Core Features Doc.docx
@@ -31,6 +31,11 @@
     </w:p>
     <w:p>
       <w:pPr>
+        <w:pStyle w:val="ListParagraph"/>
+        <w:numPr>
+          <w:ilvl w:val="0"/>
+          <w:numId w:val="7"/>
+        </w:numPr>
         <w:rPr>
           <w:b/>
           <w:bCs/>
@@ -41,783 +46,81 @@
           <w:b/>
           <w:bCs/>
         </w:rPr>
-        <w:t>1. Chat History &amp; Context Persistence (Foundational)</w:t>
-      </w:r>
-    </w:p>
-    <w:p>
-      <w:r>
-        <w:t>To keep GRACE context-aware across restarts, we will persist chat session history to an AWS DynamoDB table.</w:t>
-      </w:r>
-    </w:p>
-    <w:p>
-      <w:r>
-        <w:t>DynamoDB Table Schema Options</w:t>
-      </w:r>
-    </w:p>
-    <w:p>
-      <w:r>
-        <w:t>We have two primary design patterns for storing chat history in DynamoDB:</w:t>
-      </w:r>
-    </w:p>
-    <w:p>
-      <w:r>
-        <w:t>Option A: Granular (One Row per Message)</w:t>
-      </w:r>
-    </w:p>
-    <w:p>
-      <w:r>
-        <w:t xml:space="preserve">Every message is stored as an individual item </w:t>
-      </w:r>
-      <w:proofErr w:type="gramStart"/>
-      <w:r>
-        <w:t>in</w:t>
-      </w:r>
-      <w:proofErr w:type="gramEnd"/>
-      <w:r>
-        <w:t xml:space="preserve"> the DynamoDB table.</w:t>
-      </w:r>
-    </w:p>
-    <w:p>
-      <w:pPr>
+        <w:t>Chat History &amp; Context Persistence (Foundational)</w:t>
+      </w:r>
+    </w:p>
+    <w:p>
+      <w:pPr>
+        <w:pStyle w:val="ListParagraph"/>
         <w:numPr>
           <w:ilvl w:val="0"/>
-          <w:numId w:val="1"/>
+          <w:numId w:val="7"/>
         </w:numPr>
-      </w:pPr>
-      <w:r>
         <w:rPr>
           <w:b/>
           <w:bCs/>
         </w:rPr>
-        <w:t>Table Structure:</w:t>
-      </w:r>
-    </w:p>
-    <w:p>
-      <w:pPr>
-        <w:numPr>
-          <w:ilvl w:val="1"/>
-          <w:numId w:val="1"/>
-        </w:numPr>
       </w:pPr>
       <w:r>
         <w:rPr>
           <w:b/>
           <w:bCs/>
         </w:rPr>
-        <w:t>Partition Key (PK):</w:t>
-      </w:r>
-      <w:r>
-        <w:t> </w:t>
+        <w:t xml:space="preserve">OS integration </w:t>
       </w:r>
       <w:proofErr w:type="spellStart"/>
-      <w:r>
-        <w:t>SessionId</w:t>
-      </w:r>
-      <w:proofErr w:type="spellEnd"/>
-      <w:r>
-        <w:t> (</w:t>
-      </w:r>
-      <w:proofErr w:type="gramStart"/>
-      <w:r>
-        <w:t>String) —</w:t>
-      </w:r>
-      <w:proofErr w:type="gramEnd"/>
-      <w:r>
-        <w:t xml:space="preserve"> e.g. "default", "career-planning", or UUID.</w:t>
-      </w:r>
-    </w:p>
-    <w:p>
-      <w:pPr>
-        <w:numPr>
-          <w:ilvl w:val="1"/>
-          <w:numId w:val="1"/>
-        </w:numPr>
-      </w:pPr>
       <w:r>
         <w:rPr>
           <w:b/>
           <w:bCs/>
         </w:rPr>
-        <w:t>Sort Key (SK):</w:t>
-      </w:r>
-      <w:r>
-        <w:t xml:space="preserve"> Timestamp (String, ISO-8601 or Unix </w:t>
-      </w:r>
-      <w:proofErr w:type="gramStart"/>
-      <w:r>
-        <w:t>timestamp) —</w:t>
-      </w:r>
-      <w:proofErr w:type="gramEnd"/>
-      <w:r>
-        <w:t xml:space="preserve"> keeps messages chronological.</w:t>
-      </w:r>
-    </w:p>
-    <w:p>
-      <w:pPr>
-        <w:numPr>
-          <w:ilvl w:val="0"/>
-          <w:numId w:val="1"/>
-        </w:numPr>
-      </w:pPr>
+        <w:t>websites+apps</w:t>
+      </w:r>
+      <w:proofErr w:type="spellEnd"/>
       <w:r>
         <w:rPr>
           <w:b/>
           <w:bCs/>
         </w:rPr>
-        <w:t>Attributes:</w:t>
-      </w:r>
-    </w:p>
-    <w:p>
-      <w:pPr>
-        <w:numPr>
-          <w:ilvl w:val="1"/>
-          <w:numId w:val="1"/>
-        </w:numPr>
-      </w:pPr>
-      <w:r>
-        <w:t>Speaker (String): "YOU" or "GRACE"</w:t>
-      </w:r>
-    </w:p>
-    <w:p>
-      <w:pPr>
-        <w:numPr>
-          <w:ilvl w:val="1"/>
-          <w:numId w:val="1"/>
-        </w:numPr>
-      </w:pPr>
-      <w:r>
-        <w:t>Text (String): The message text.</w:t>
-      </w:r>
-    </w:p>
-    <w:p>
-      <w:pPr>
-        <w:numPr>
-          <w:ilvl w:val="1"/>
-          <w:numId w:val="1"/>
-        </w:numPr>
-      </w:pPr>
-      <w:r>
-        <w:t>Tokens (Number): Optional token count metadata.</w:t>
-      </w:r>
-    </w:p>
-    <w:p>
-      <w:pPr>
-        <w:numPr>
-          <w:ilvl w:val="0"/>
-          <w:numId w:val="1"/>
-        </w:numPr>
-      </w:pPr>
-      <w:r>
+        <w:t xml:space="preserve"> and stuff</w:t>
+      </w:r>
+    </w:p>
+    <w:p>
+      <w:pPr>
         <w:rPr>
           <w:b/>
           <w:bCs/>
         </w:rPr>
-        <w:t>Operations:</w:t>
-      </w:r>
-    </w:p>
-    <w:p>
-      <w:pPr>
-        <w:numPr>
-          <w:ilvl w:val="1"/>
-          <w:numId w:val="1"/>
-        </w:numPr>
-      </w:pPr>
-      <w:r>
-        <w:rPr>
-          <w:i/>
-          <w:iCs/>
-        </w:rPr>
-        <w:t>Write:</w:t>
-      </w:r>
-      <w:r>
-        <w:t> Call </w:t>
-      </w:r>
-      <w:proofErr w:type="spellStart"/>
-      <w:r>
-        <w:t>PutItem</w:t>
-      </w:r>
-      <w:proofErr w:type="spellEnd"/>
-      <w:r>
-        <w:t xml:space="preserve"> for every user input and </w:t>
-      </w:r>
-      <w:proofErr w:type="gramStart"/>
-      <w:r>
-        <w:t>assistant</w:t>
-      </w:r>
-      <w:proofErr w:type="gramEnd"/>
-      <w:r>
-        <w:t xml:space="preserve"> response.</w:t>
-      </w:r>
-    </w:p>
-    <w:p>
-      <w:pPr>
-        <w:numPr>
-          <w:ilvl w:val="1"/>
-          <w:numId w:val="1"/>
-        </w:numPr>
-      </w:pPr>
-      <w:r>
-        <w:rPr>
-          <w:i/>
-          <w:iCs/>
-        </w:rPr>
-        <w:t>Read:</w:t>
-      </w:r>
-      <w:r>
-        <w:t> Call Query with </w:t>
-      </w:r>
-      <w:proofErr w:type="spellStart"/>
-      <w:r>
-        <w:t>PartitionKey</w:t>
-      </w:r>
-      <w:proofErr w:type="spellEnd"/>
-      <w:r>
-        <w:t>="default" to fetch the history. We can limit the query (e.g. Limit=50) and read in descending order (</w:t>
-      </w:r>
-      <w:proofErr w:type="spellStart"/>
-      <w:r>
-        <w:t>ScanIndexForward</w:t>
-      </w:r>
-      <w:proofErr w:type="spellEnd"/>
-      <w:r>
-        <w:t>=False) to get the latest messages.</w:t>
-      </w:r>
-    </w:p>
-    <w:p>
-      <w:r>
-        <w:t>Option B: Document Store (One Row per Session) — [Recommended]</w:t>
-      </w:r>
-    </w:p>
-    <w:p>
-      <w:r>
-        <w:lastRenderedPageBreak/>
-        <w:t>The entire chat history of a session is stored inside a single DynamoDB item as a list of maps.</w:t>
-      </w:r>
-    </w:p>
-    <w:p>
-      <w:pPr>
-        <w:numPr>
-          <w:ilvl w:val="0"/>
-          <w:numId w:val="2"/>
-        </w:numPr>
       </w:pPr>
       <w:r>
         <w:rPr>
           <w:b/>
           <w:bCs/>
         </w:rPr>
-        <w:t>Table Structure:</w:t>
-      </w:r>
-    </w:p>
-    <w:p>
-      <w:pPr>
-        <w:numPr>
-          <w:ilvl w:val="1"/>
-          <w:numId w:val="2"/>
-        </w:numPr>
-      </w:pPr>
+        <w:t xml:space="preserve">       </w:t>
+      </w:r>
       <w:r>
         <w:rPr>
           <w:b/>
           <w:bCs/>
         </w:rPr>
-        <w:t>Partition Key (PK):</w:t>
-      </w:r>
-      <w:r>
-        <w:t> </w:t>
-      </w:r>
-      <w:proofErr w:type="spellStart"/>
-      <w:r>
-        <w:t>SessionId</w:t>
-      </w:r>
-      <w:proofErr w:type="spellEnd"/>
-      <w:r>
-        <w:t> (</w:t>
-      </w:r>
-      <w:proofErr w:type="gramStart"/>
-      <w:r>
-        <w:t>String) —</w:t>
-      </w:r>
-      <w:proofErr w:type="gramEnd"/>
-      <w:r>
-        <w:t xml:space="preserve"> e.g. "default".</w:t>
-      </w:r>
-    </w:p>
-    <w:p>
-      <w:pPr>
-        <w:numPr>
-          <w:ilvl w:val="0"/>
-          <w:numId w:val="2"/>
-        </w:numPr>
-      </w:pPr>
-      <w:r>
+        <w:t>3. Daily Briefing on Wake Word (First Trigger of the Day)</w:t>
+      </w:r>
+    </w:p>
+    <w:p>
+      <w:pPr>
         <w:rPr>
           <w:b/>
           <w:bCs/>
         </w:rPr>
-        <w:t>Attributes:</w:t>
-      </w:r>
-    </w:p>
-    <w:p>
-      <w:pPr>
-        <w:numPr>
-          <w:ilvl w:val="1"/>
-          <w:numId w:val="2"/>
-        </w:numPr>
-      </w:pPr>
-      <w:r>
-        <w:t>History (List of Maps):</w:t>
-      </w:r>
-    </w:p>
-    <w:p>
-      <w:proofErr w:type="spellStart"/>
-      <w:r>
-        <w:t>json</w:t>
-      </w:r>
-      <w:proofErr w:type="spellEnd"/>
-    </w:p>
-    <w:p>
-      <w:r>
-        <w:t>[</w:t>
-      </w:r>
-    </w:p>
-    <w:p>
-      <w:r>
-        <w:t xml:space="preserve">  {"role": "user", "text": "How can I improve my daily focus</w:t>
-      </w:r>
-      <w:proofErr w:type="gramStart"/>
-      <w:r>
-        <w:t>?"}</w:t>
-      </w:r>
-      <w:proofErr w:type="gramEnd"/>
-      <w:r>
-        <w:t>,</w:t>
-      </w:r>
-    </w:p>
-    <w:p>
-      <w:r>
-        <w:t xml:space="preserve">  {"role": "model", "text": "Let's review your current daily routine</w:t>
-      </w:r>
-      <w:proofErr w:type="gramStart"/>
-      <w:r>
-        <w:t>..."}</w:t>
-      </w:r>
-      <w:proofErr w:type="gramEnd"/>
-    </w:p>
-    <w:p>
-      <w:r>
-        <w:t>]</w:t>
-      </w:r>
-    </w:p>
-    <w:p>
-      <w:pPr>
-        <w:numPr>
-          <w:ilvl w:val="1"/>
-          <w:numId w:val="2"/>
-        </w:numPr>
-      </w:pPr>
-      <w:proofErr w:type="spellStart"/>
-      <w:r>
-        <w:t>LastUpdated</w:t>
-      </w:r>
-      <w:proofErr w:type="spellEnd"/>
-      <w:r>
-        <w:t> (String): Timestamp.</w:t>
-      </w:r>
-    </w:p>
-    <w:p>
-      <w:pPr>
-        <w:numPr>
-          <w:ilvl w:val="0"/>
-          <w:numId w:val="2"/>
-        </w:numPr>
       </w:pPr>
       <w:r>
         <w:rPr>
           <w:b/>
           <w:bCs/>
         </w:rPr>
-        <w:t>Operations:</w:t>
-      </w:r>
-    </w:p>
-    <w:p>
-      <w:pPr>
-        <w:numPr>
-          <w:ilvl w:val="1"/>
-          <w:numId w:val="2"/>
-        </w:numPr>
-      </w:pPr>
-      <w:r>
-        <w:rPr>
-          <w:i/>
-          <w:iCs/>
-        </w:rPr>
-        <w:t>Write:</w:t>
-      </w:r>
-      <w:r>
-        <w:t> Append new messages to the list using </w:t>
-      </w:r>
-      <w:proofErr w:type="spellStart"/>
-      <w:r>
-        <w:t>UpdateItem</w:t>
-      </w:r>
-      <w:proofErr w:type="spellEnd"/>
-      <w:r>
-        <w:t xml:space="preserve"> with an update expression: SET History = </w:t>
-      </w:r>
-      <w:proofErr w:type="spellStart"/>
-      <w:r>
-        <w:t>list_</w:t>
-      </w:r>
-      <w:proofErr w:type="gramStart"/>
-      <w:r>
-        <w:t>append</w:t>
-      </w:r>
-      <w:proofErr w:type="spellEnd"/>
-      <w:r>
-        <w:t>(</w:t>
-      </w:r>
-      <w:proofErr w:type="spellStart"/>
-      <w:proofErr w:type="gramEnd"/>
-      <w:r>
-        <w:t>if_not_</w:t>
-      </w:r>
-      <w:proofErr w:type="gramStart"/>
-      <w:r>
-        <w:t>exists</w:t>
-      </w:r>
-      <w:proofErr w:type="spellEnd"/>
-      <w:r>
-        <w:t>(</w:t>
-      </w:r>
-      <w:proofErr w:type="gramEnd"/>
-      <w:r>
-        <w:t>History</w:t>
-      </w:r>
-      <w:proofErr w:type="gramStart"/>
-      <w:r>
-        <w:t>, :empty</w:t>
-      </w:r>
-      <w:proofErr w:type="gramEnd"/>
-      <w:r>
-        <w:t>)</w:t>
-      </w:r>
-      <w:proofErr w:type="gramStart"/>
-      <w:r>
-        <w:t>, :</w:t>
-      </w:r>
-      <w:proofErr w:type="spellStart"/>
-      <w:r>
-        <w:t>new</w:t>
-      </w:r>
-      <w:proofErr w:type="gramEnd"/>
-      <w:r>
-        <w:t>_msgs</w:t>
-      </w:r>
-      <w:proofErr w:type="spellEnd"/>
-      <w:r>
-        <w:t xml:space="preserve">), </w:t>
-      </w:r>
-      <w:proofErr w:type="spellStart"/>
-      <w:r>
-        <w:t>LastUpdated</w:t>
-      </w:r>
-      <w:proofErr w:type="spellEnd"/>
-      <w:r>
-        <w:t xml:space="preserve"> </w:t>
-      </w:r>
-      <w:proofErr w:type="gramStart"/>
-      <w:r>
-        <w:t>= :now</w:t>
-      </w:r>
-      <w:proofErr w:type="gramEnd"/>
-    </w:p>
-    <w:p>
-      <w:pPr>
-        <w:numPr>
-          <w:ilvl w:val="1"/>
-          <w:numId w:val="2"/>
-        </w:numPr>
-      </w:pPr>
-      <w:r>
-        <w:rPr>
-          <w:i/>
-          <w:iCs/>
-        </w:rPr>
-        <w:t>Read:</w:t>
-      </w:r>
-      <w:r>
-        <w:t> Call a single </w:t>
-      </w:r>
-      <w:proofErr w:type="spellStart"/>
-      <w:r>
-        <w:t>GetItem</w:t>
-      </w:r>
-      <w:proofErr w:type="spellEnd"/>
-      <w:r>
-        <w:t> with PK="default" on startup.</w:t>
-      </w:r>
-    </w:p>
-    <w:p>
-      <w:pPr>
-        <w:numPr>
-          <w:ilvl w:val="0"/>
-          <w:numId w:val="2"/>
-        </w:numPr>
-      </w:pPr>
-      <w:r>
-        <w:rPr>
-          <w:b/>
-          <w:bCs/>
-        </w:rPr>
-        <w:t>Why Option B is Recommended:</w:t>
-      </w:r>
-    </w:p>
-    <w:p>
-      <w:pPr>
-        <w:numPr>
-          <w:ilvl w:val="1"/>
-          <w:numId w:val="2"/>
-        </w:numPr>
-      </w:pPr>
-      <w:r>
-        <w:rPr>
-          <w:b/>
-          <w:bCs/>
-        </w:rPr>
-        <w:t>Minimal Read Capacity Units (RCUs):</w:t>
-      </w:r>
-      <w:r>
-        <w:t> Loads the entire session history in a single, fast read request rather than scanning/querying multiple items.</w:t>
-      </w:r>
-    </w:p>
-    <w:p>
-      <w:pPr>
-        <w:numPr>
-          <w:ilvl w:val="1"/>
-          <w:numId w:val="2"/>
-        </w:numPr>
-      </w:pPr>
-      <w:r>
-        <w:rPr>
-          <w:b/>
-          <w:bCs/>
-        </w:rPr>
-        <w:t>Direct Compatibility:</w:t>
-      </w:r>
-      <w:r>
-        <w:t> The structured list maps directly to the GenAI SDK's history parameter without needing to parse and sort multiple table rows.</w:t>
-      </w:r>
-    </w:p>
-    <w:p>
-      <w:pPr>
-        <w:numPr>
-          <w:ilvl w:val="1"/>
-          <w:numId w:val="2"/>
-        </w:numPr>
-      </w:pPr>
-      <w:r>
-        <w:rPr>
-          <w:b/>
-          <w:bCs/>
-        </w:rPr>
-        <w:t>Capacity:</w:t>
-      </w:r>
-      <w:r>
-        <w:t> DynamoDB's 400KB item limit fits over 50,000 words of conversational history, which is more than enough for a standard active chat window before truncation is required.</w:t>
-      </w:r>
-    </w:p>
-    <w:p>
-      <w:r>
-        <w:pict w14:anchorId="7D9A630D">
-          <v:rect id="_x0000_i1028" style="width:654pt;height:.75pt" o:hrpct="0" o:hralign="center" o:hrstd="t" o:hr="t" fillcolor="#a0a0a0" stroked="f"/>
-        </w:pict>
-      </w:r>
-    </w:p>
-    <w:p>
-      <w:pPr>
-        <w:rPr>
-          <w:b/>
-          <w:bCs/>
-        </w:rPr>
-      </w:pPr>
-    </w:p>
-    <w:p>
-      <w:pPr>
-        <w:rPr>
-          <w:b/>
-          <w:bCs/>
-        </w:rPr>
-      </w:pPr>
-      <w:r>
-        <w:rPr>
-          <w:b/>
-          <w:bCs/>
-        </w:rPr>
-        <w:lastRenderedPageBreak/>
-        <w:t>3. Daily Briefing on Wake Word (First Trigger of the Day)</w:t>
-      </w:r>
-    </w:p>
-    <w:p>
-      <w:r>
-        <w:t xml:space="preserve">GRACE will notice when it is the first time you are speaking to her </w:t>
-      </w:r>
-      <w:proofErr w:type="gramStart"/>
-      <w:r>
-        <w:t>in</w:t>
-      </w:r>
-      <w:proofErr w:type="gramEnd"/>
-      <w:r>
-        <w:t xml:space="preserve"> a calendar day, greeting you with a focused, 30-second daily briefing.</w:t>
-      </w:r>
-    </w:p>
-    <w:p>
-      <w:pPr>
-        <w:numPr>
-          <w:ilvl w:val="0"/>
-          <w:numId w:val="4"/>
-        </w:numPr>
-      </w:pPr>
-      <w:r>
-        <w:rPr>
-          <w:b/>
-          <w:bCs/>
-        </w:rPr>
-        <w:t>Trigger Logic:</w:t>
-      </w:r>
-    </w:p>
-    <w:p>
-      <w:pPr>
-        <w:numPr>
-          <w:ilvl w:val="1"/>
-          <w:numId w:val="4"/>
-        </w:numPr>
-      </w:pPr>
-      <w:r>
-        <w:t>Save a </w:t>
-      </w:r>
-      <w:proofErr w:type="spellStart"/>
-      <w:r>
-        <w:t>last_brief_date</w:t>
-      </w:r>
-      <w:proofErr w:type="spellEnd"/>
-      <w:r>
-        <w:t> timestamp in a local state file.</w:t>
-      </w:r>
-    </w:p>
-    <w:p>
-      <w:pPr>
-        <w:numPr>
-          <w:ilvl w:val="1"/>
-          <w:numId w:val="4"/>
-        </w:numPr>
-      </w:pPr>
-      <w:r>
-        <w:t>Upon the first wake word validation (</w:t>
-      </w:r>
-      <w:proofErr w:type="spellStart"/>
-      <w:r>
-        <w:t>hey_mycroft</w:t>
-      </w:r>
-      <w:proofErr w:type="spellEnd"/>
-      <w:r>
-        <w:t>) of a new calendar day, if </w:t>
-      </w:r>
-      <w:proofErr w:type="spellStart"/>
-      <w:r>
-        <w:t>current_date</w:t>
-      </w:r>
-      <w:proofErr w:type="spellEnd"/>
-      <w:r>
-        <w:t xml:space="preserve"> &gt; </w:t>
-      </w:r>
-      <w:proofErr w:type="spellStart"/>
-      <w:r>
-        <w:t>last_brief_date</w:t>
-      </w:r>
-      <w:proofErr w:type="spellEnd"/>
-      <w:r>
-        <w:t>, trigger a specialized briefing state.</w:t>
-      </w:r>
-    </w:p>
-    <w:p>
-      <w:pPr>
-        <w:numPr>
-          <w:ilvl w:val="0"/>
-          <w:numId w:val="4"/>
-        </w:numPr>
-      </w:pPr>
-      <w:r>
-        <w:rPr>
-          <w:b/>
-          <w:bCs/>
-        </w:rPr>
-        <w:t>Information Aggregation:</w:t>
-      </w:r>
-    </w:p>
-    <w:p>
-      <w:pPr>
-        <w:numPr>
-          <w:ilvl w:val="1"/>
-          <w:numId w:val="4"/>
-        </w:numPr>
-      </w:pPr>
-      <w:r>
-        <w:t>Query the </w:t>
-      </w:r>
-      <w:proofErr w:type="spellStart"/>
-      <w:r>
-        <w:t>Grace_Expenses</w:t>
-      </w:r>
-      <w:proofErr w:type="spellEnd"/>
-      <w:r>
-        <w:t> table for a quick summary of yesterday's spendings.</w:t>
-      </w:r>
-    </w:p>
-    <w:p>
-      <w:pPr>
-        <w:numPr>
-          <w:ilvl w:val="1"/>
-          <w:numId w:val="4"/>
-        </w:numPr>
-      </w:pPr>
-      <w:r>
-        <w:t>Query the </w:t>
-      </w:r>
-      <w:proofErr w:type="spellStart"/>
-      <w:r>
-        <w:t>Grace_Goals</w:t>
-      </w:r>
-      <w:proofErr w:type="spellEnd"/>
-      <w:r>
-        <w:t> table for pending tasks.</w:t>
-      </w:r>
-    </w:p>
-    <w:p>
-      <w:pPr>
-        <w:numPr>
-          <w:ilvl w:val="1"/>
-          <w:numId w:val="4"/>
-        </w:numPr>
-      </w:pPr>
-      <w:r>
-        <w:t>Scan the end of yesterday's conversation log for any flagged items.</w:t>
-      </w:r>
-    </w:p>
-    <w:p>
-      <w:r>
-        <w:pict w14:anchorId="26D6E5F5">
-          <v:rect id="_x0000_i1029" style="width:654pt;height:.75pt" o:hrpct="0" o:hralign="center" o:hrstd="t" o:hr="t" fillcolor="#a0a0a0" stroked="f"/>
-        </w:pict>
-      </w:r>
-    </w:p>
-    <w:p>
-      <w:pPr>
-        <w:rPr>
-          <w:b/>
-          <w:bCs/>
-        </w:rPr>
-      </w:pPr>
+        <w:t xml:space="preserve">      </w:t>
+      </w:r>
       <w:r>
         <w:rPr>
           <w:b/>
@@ -1004,14 +307,13 @@
         </w:numPr>
       </w:pPr>
       <w:r>
-        <w:lastRenderedPageBreak/>
         <w:t>When a similar decision arises in the future, GRACE scans the database to surface relevant notes.</w:t>
       </w:r>
     </w:p>
     <w:p>
       <w:r>
         <w:pict w14:anchorId="1D40A1C7">
-          <v:rect id="_x0000_i1030" style="width:654pt;height:.75pt" o:hrpct="0" o:hralign="center" o:hrstd="t" o:hr="t" fillcolor="#a0a0a0" stroked="f"/>
+          <v:rect id="_x0000_i1028" style="width:654pt;height:.75pt" o:hrpct="0" o:hralign="center" o:hrstd="t" o:hr="t" fillcolor="#a0a0a0" stroked="f"/>
         </w:pict>
       </w:r>
     </w:p>
@@ -1032,6 +334,7 @@
     </w:p>
     <w:p>
       <w:r>
+        <w:lastRenderedPageBreak/>
         <w:t>A voice-based journaling pipeline designed to recognize emotional patterns, help manage anxiety, and catch repetitive negative thinking loops.</w:t>
       </w:r>
     </w:p>
@@ -1153,6 +456,95 @@
 <file path=word/numbering.xml><?xml version="1.0" encoding="utf-8"?>
 <w:numbering xmlns:wpc="http://schemas.microsoft.com/office/word/2010/wordprocessingCanvas" xmlns:cx="http://schemas.microsoft.com/office/drawing/2014/chartex" xmlns:cx1="http://schemas.microsoft.com/office/drawing/2015/9/8/chartex" xmlns:cx2="http://schemas.microsoft.com/office/drawing/2015/10/21/chartex" xmlns:cx3="http://schemas.microsoft.com/office/drawing/2016/5/9/chartex" xmlns:cx4="http://schemas.microsoft.com/office/drawing/2016/5/10/chartex" xmlns:cx5="http://schemas.microsoft.com/office/drawing/2016/5/11/chartex" xmlns:cx6="http://schemas.microsoft.com/office/drawing/2016/5/12/chartex" xmlns:cx7="http://schemas.microsoft.com/office/drawing/2016/5/13/chartex" xmlns:cx8="http://schemas.microsoft.com/office/drawing/2016/5/14/chartex" xmlns:mc="http://schemas.openxmlformats.org/markup-compatibility/2006" xmlns:aink="http://schemas.microsoft.com/office/drawing/2016/ink" xmlns:am3d="http://schemas.microsoft.com/office/drawing/2017/model3d" xmlns:o="urn:schemas-microsoft-com:office:office" xmlns:oel="http://schemas.microsoft.com/office/2019/extlst" xmlns:r="http://schemas.openxmlformats.org/officeDocument/2006/relationships" xmlns:m="http://schemas.openxmlformats.org/officeDocument/2006/math" xmlns:v="urn:schemas-microsoft-com:vml" xmlns:wp14="http://schemas.microsoft.com/office/word/2010/wordprocessingDrawing" xmlns:wp="http://schemas.openxmlformats.org/drawingml/2006/wordprocessingDrawing" xmlns:w10="urn:schemas-microsoft-com:office:word" xmlns:w="http://schemas.openxmlformats.org/wordprocessingml/2006/main" xmlns:w14="http://schemas.microsoft.com/office/word/2010/wordml" xmlns:w15="http://schemas.microsoft.com/office/word/2012/wordml" xmlns:w16cex="http://schemas.microsoft.com/office/word/2018/wordml/cex" xmlns:w16cid="http://schemas.microsoft.com/office/word/2016/wordml/cid" xmlns:w16="http://schemas.microsoft.com/office/word/2018/wordml" xmlns:w16du="http://schemas.microsoft.com/office/word/2023/wordml/word16du" xmlns:w16sdtdh="http://schemas.microsoft.com/office/word/2020/wordml/sdtdatahash" xmlns:w16sdtfl="http://schemas.microsoft.com/office/word/2024/wordml/sdtformatlock" xmlns:w16se="http://schemas.microsoft.com/office/word/2015/wordml/symex" xmlns:wpg="http://schemas.microsoft.com/office/word/2010/wordprocessingGroup" xmlns:wpi="http://schemas.microsoft.com/office/word/2010/wordprocessingInk" xmlns:wne="http://schemas.microsoft.com/office/word/2006/wordml" xmlns:wps="http://schemas.microsoft.com/office/word/2010/wordprocessingShape" mc:Ignorable="w14 w15 w16se w16cid w16 w16cex w16sdtdh w16sdtfl w16du wp14">
   <w:abstractNum w:abstractNumId="0" w15:restartNumberingAfterBreak="0">
+    <w:nsid w:val="0FCD4D88"/>
+    <w:multiLevelType w:val="hybridMultilevel"/>
+    <w:tmpl w:val="64A8D5B6"/>
+    <w:lvl w:ilvl="0" w:tplc="0409000F">
+      <w:start w:val="1"/>
+      <w:numFmt w:val="decimal"/>
+      <w:lvlText w:val="%1."/>
+      <w:lvlJc w:val="left"/>
+      <w:pPr>
+        <w:ind w:left="720" w:hanging="360"/>
+      </w:pPr>
+      <w:rPr>
+        <w:rFonts w:hint="default"/>
+      </w:rPr>
+    </w:lvl>
+    <w:lvl w:ilvl="1" w:tplc="04090019" w:tentative="1">
+      <w:start w:val="1"/>
+      <w:numFmt w:val="lowerLetter"/>
+      <w:lvlText w:val="%2."/>
+      <w:lvlJc w:val="left"/>
+      <w:pPr>
+        <w:ind w:left="1440" w:hanging="360"/>
+      </w:pPr>
+    </w:lvl>
+    <w:lvl w:ilvl="2" w:tplc="0409001B" w:tentative="1">
+      <w:start w:val="1"/>
+      <w:numFmt w:val="lowerRoman"/>
+      <w:lvlText w:val="%3."/>
+      <w:lvlJc w:val="right"/>
+      <w:pPr>
+        <w:ind w:left="2160" w:hanging="180"/>
+      </w:pPr>
+    </w:lvl>
+    <w:lvl w:ilvl="3" w:tplc="0409000F" w:tentative="1">
+      <w:start w:val="1"/>
+      <w:numFmt w:val="decimal"/>
+      <w:lvlText w:val="%4."/>
+      <w:lvlJc w:val="left"/>
+      <w:pPr>
+        <w:ind w:left="2880" w:hanging="360"/>
+      </w:pPr>
+    </w:lvl>
+    <w:lvl w:ilvl="4" w:tplc="04090019" w:tentative="1">
+      <w:start w:val="1"/>
+      <w:numFmt w:val="lowerLetter"/>
+      <w:lvlText w:val="%5."/>
+      <w:lvlJc w:val="left"/>
+      <w:pPr>
+        <w:ind w:left="3600" w:hanging="360"/>
+      </w:pPr>
+    </w:lvl>
+    <w:lvl w:ilvl="5" w:tplc="0409001B" w:tentative="1">
+      <w:start w:val="1"/>
+      <w:numFmt w:val="lowerRoman"/>
+      <w:lvlText w:val="%6."/>
+      <w:lvlJc w:val="right"/>
+      <w:pPr>
+        <w:ind w:left="4320" w:hanging="180"/>
+      </w:pPr>
+    </w:lvl>
+    <w:lvl w:ilvl="6" w:tplc="0409000F" w:tentative="1">
+      <w:start w:val="1"/>
+      <w:numFmt w:val="decimal"/>
+      <w:lvlText w:val="%7."/>
+      <w:lvlJc w:val="left"/>
+      <w:pPr>
+        <w:ind w:left="5040" w:hanging="360"/>
+      </w:pPr>
+    </w:lvl>
+    <w:lvl w:ilvl="7" w:tplc="04090019" w:tentative="1">
+      <w:start w:val="1"/>
+      <w:numFmt w:val="lowerLetter"/>
+      <w:lvlText w:val="%8."/>
+      <w:lvlJc w:val="left"/>
+      <w:pPr>
+        <w:ind w:left="5760" w:hanging="360"/>
+      </w:pPr>
+    </w:lvl>
+    <w:lvl w:ilvl="8" w:tplc="0409001B" w:tentative="1">
+      <w:start w:val="1"/>
+      <w:numFmt w:val="lowerRoman"/>
+      <w:lvlText w:val="%9."/>
+      <w:lvlJc w:val="right"/>
+      <w:pPr>
+        <w:ind w:left="6480" w:hanging="180"/>
+      </w:pPr>
+    </w:lvl>
+  </w:abstractNum>
+  <w:abstractNum w:abstractNumId="1" w15:restartNumberingAfterBreak="0">
     <w:nsid w:val="10954A98"/>
     <w:multiLevelType w:val="multilevel"/>
     <w:tmpl w:val="CB30AD30"/>
@@ -1301,7 +693,7 @@
       </w:rPr>
     </w:lvl>
   </w:abstractNum>
-  <w:abstractNum w:abstractNumId="1" w15:restartNumberingAfterBreak="0">
+  <w:abstractNum w:abstractNumId="2" w15:restartNumberingAfterBreak="0">
     <w:nsid w:val="2BD36653"/>
     <w:multiLevelType w:val="multilevel"/>
     <w:tmpl w:val="85FEC278"/>
@@ -1450,7 +842,7 @@
       </w:rPr>
     </w:lvl>
   </w:abstractNum>
-  <w:abstractNum w:abstractNumId="2" w15:restartNumberingAfterBreak="0">
+  <w:abstractNum w:abstractNumId="3" w15:restartNumberingAfterBreak="0">
     <w:nsid w:val="372E16DD"/>
     <w:multiLevelType w:val="multilevel"/>
     <w:tmpl w:val="A140C078"/>
@@ -1599,7 +991,7 @@
       </w:rPr>
     </w:lvl>
   </w:abstractNum>
-  <w:abstractNum w:abstractNumId="3" w15:restartNumberingAfterBreak="0">
+  <w:abstractNum w:abstractNumId="4" w15:restartNumberingAfterBreak="0">
     <w:nsid w:val="53A34C61"/>
     <w:multiLevelType w:val="multilevel"/>
     <w:tmpl w:val="D612F12A"/>
@@ -1748,7 +1140,7 @@
       </w:rPr>
     </w:lvl>
   </w:abstractNum>
-  <w:abstractNum w:abstractNumId="4" w15:restartNumberingAfterBreak="0">
+  <w:abstractNum w:abstractNumId="5" w15:restartNumberingAfterBreak="0">
     <w:nsid w:val="66C8542F"/>
     <w:multiLevelType w:val="multilevel"/>
     <w:tmpl w:val="C74AE1E4"/>
@@ -1897,7 +1289,7 @@
       </w:rPr>
     </w:lvl>
   </w:abstractNum>
-  <w:abstractNum w:abstractNumId="5" w15:restartNumberingAfterBreak="0">
+  <w:abstractNum w:abstractNumId="6" w15:restartNumberingAfterBreak="0">
     <w:nsid w:val="67283534"/>
     <w:multiLevelType w:val="multilevel"/>
     <w:tmpl w:val="B8E25514"/>
@@ -2047,22 +1439,25 @@
     </w:lvl>
   </w:abstractNum>
   <w:num w:numId="1" w16cid:durableId="399334348">
+    <w:abstractNumId w:val="2"/>
+  </w:num>
+  <w:num w:numId="2" w16cid:durableId="684287077">
+    <w:abstractNumId w:val="6"/>
+  </w:num>
+  <w:num w:numId="3" w16cid:durableId="434786671">
+    <w:abstractNumId w:val="3"/>
+  </w:num>
+  <w:num w:numId="4" w16cid:durableId="1162701984">
+    <w:abstractNumId w:val="4"/>
+  </w:num>
+  <w:num w:numId="5" w16cid:durableId="1019426061">
     <w:abstractNumId w:val="1"/>
   </w:num>
-  <w:num w:numId="2" w16cid:durableId="684287077">
+  <w:num w:numId="6" w16cid:durableId="1244799695">
     <w:abstractNumId w:val="5"/>
   </w:num>
-  <w:num w:numId="3" w16cid:durableId="434786671">
-    <w:abstractNumId w:val="2"/>
-  </w:num>
-  <w:num w:numId="4" w16cid:durableId="1162701984">
-    <w:abstractNumId w:val="3"/>
-  </w:num>
-  <w:num w:numId="5" w16cid:durableId="1019426061">
+  <w:num w:numId="7" w16cid:durableId="1170606715">
     <w:abstractNumId w:val="0"/>
-  </w:num>
-  <w:num w:numId="6" w16cid:durableId="1244799695">
-    <w:abstractNumId w:val="4"/>
   </w:num>
 </w:numbering>
 </file>

</xml_diff>

<commit_message>
feat: implement AI core services, chat routing, and task-oriented LLM tools with RAG integration and custom system instructions.
</commit_message>
<xml_diff>
--- a/Design Docs/Core Features Doc.docx
+++ b/Design Docs/Core Features Doc.docx
@@ -82,23 +82,30 @@
           <w:b/>
           <w:bCs/>
         </w:rPr>
-        <w:t xml:space="preserve"> and stuff</w:t>
-      </w:r>
-    </w:p>
-    <w:p>
-      <w:pPr>
+        <w:t xml:space="preserve"> and </w:t>
+      </w:r>
+      <w:proofErr w:type="spellStart"/>
+      <w:r>
         <w:rPr>
           <w:b/>
           <w:bCs/>
         </w:rPr>
-      </w:pPr>
-      <w:r>
+        <w:t>stuf</w:t>
+      </w:r>
+      <w:proofErr w:type="spellEnd"/>
+    </w:p>
+    <w:p>
+      <w:pPr>
+        <w:pStyle w:val="ListParagraph"/>
+        <w:numPr>
+          <w:ilvl w:val="0"/>
+          <w:numId w:val="7"/>
+        </w:numPr>
         <w:rPr>
           <w:b/>
           <w:bCs/>
         </w:rPr>
-        <w:t xml:space="preserve">       </w:t>
-      </w:r>
+      </w:pPr>
       <w:r>
         <w:rPr>
           <w:b/>
@@ -121,6 +128,22 @@
         </w:rPr>
         <w:t xml:space="preserve">      </w:t>
       </w:r>
+    </w:p>
+    <w:p>
+      <w:pPr>
+        <w:rPr>
+          <w:b/>
+          <w:bCs/>
+        </w:rPr>
+      </w:pPr>
+    </w:p>
+    <w:p>
+      <w:pPr>
+        <w:rPr>
+          <w:b/>
+          <w:bCs/>
+        </w:rPr>
+      </w:pPr>
       <w:r>
         <w:rPr>
           <w:b/>
@@ -313,7 +336,7 @@
     <w:p>
       <w:r>
         <w:pict w14:anchorId="1D40A1C7">
-          <v:rect id="_x0000_i1028" style="width:654pt;height:.75pt" o:hrpct="0" o:hralign="center" o:hrstd="t" o:hr="t" fillcolor="#a0a0a0" stroked="f"/>
+          <v:rect id="_x0000_i1026" style="width:654pt;height:.75pt" o:hrpct="0" o:hralign="center" o:hrstd="t" o:hr="t" fillcolor="#a0a0a0" stroked="f"/>
         </w:pict>
       </w:r>
     </w:p>
@@ -329,12 +352,12 @@
           <w:b/>
           <w:bCs/>
         </w:rPr>
+        <w:lastRenderedPageBreak/>
         <w:t>5. Voice Mood &amp; Reflection Journal</w:t>
       </w:r>
     </w:p>
     <w:p>
       <w:r>
-        <w:lastRenderedPageBreak/>
         <w:t>A voice-based journaling pipeline designed to recognize emotional patterns, help manage anxiety, and catch repetitive negative thinking loops.</w:t>
       </w:r>
     </w:p>
@@ -442,6 +465,13 @@
         <w:t> table.</w:t>
       </w:r>
     </w:p>
+    <w:p/>
+    <w:p>
+      <w:r>
+        <w:t>GOOGLE MAPS INTEGRATION</w:t>
+      </w:r>
+    </w:p>
+    <w:p/>
     <w:p/>
     <w:sectPr>
       <w:pgSz w:w="12240" w:h="15840"/>

</xml_diff>

<commit_message>
feat: implement TomTom-integrated mapping service and interactive HUD components
</commit_message>
<xml_diff>
--- a/Design Docs/Core Features Doc.docx
+++ b/Design Docs/Core Features Doc.docx
@@ -82,17 +82,15 @@
           <w:b/>
           <w:bCs/>
         </w:rPr>
-        <w:t xml:space="preserve"> and </w:t>
-      </w:r>
-      <w:proofErr w:type="spellStart"/>
+        <w:t xml:space="preserve"> and stuf</w:t>
+      </w:r>
       <w:r>
         <w:rPr>
           <w:b/>
           <w:bCs/>
         </w:rPr>
-        <w:t>stuf</w:t>
-      </w:r>
-      <w:proofErr w:type="spellEnd"/>
+        <w:t>f</w:t>
+      </w:r>
     </w:p>
     <w:p>
       <w:pPr>
@@ -116,6 +114,42 @@
     </w:p>
     <w:p>
       <w:pPr>
+        <w:pStyle w:val="ListParagraph"/>
+        <w:numPr>
+          <w:ilvl w:val="0"/>
+          <w:numId w:val="7"/>
+        </w:numPr>
+      </w:pPr>
+      <w:r>
+        <w:t>MAPS INTEGRATION</w:t>
+      </w:r>
+      <w:r>
+        <w:t xml:space="preserve"> (tom </w:t>
+      </w:r>
+      <w:proofErr w:type="spellStart"/>
+      <w:r>
+        <w:t>tom</w:t>
+      </w:r>
+      <w:proofErr w:type="spellEnd"/>
+      <w:r>
+        <w:t xml:space="preserve"> maps)</w:t>
+      </w:r>
+    </w:p>
+    <w:p>
+      <w:pPr>
+        <w:pStyle w:val="ListParagraph"/>
+        <w:numPr>
+          <w:ilvl w:val="0"/>
+          <w:numId w:val="7"/>
+        </w:numPr>
+        <w:rPr>
+          <w:b/>
+          <w:bCs/>
+        </w:rPr>
+      </w:pPr>
+    </w:p>
+    <w:p>
+      <w:pPr>
         <w:rPr>
           <w:b/>
           <w:bCs/>
@@ -300,15 +334,7 @@
         </w:numPr>
       </w:pPr>
       <w:r>
-        <w:t xml:space="preserve">When you </w:t>
-      </w:r>
-      <w:proofErr w:type="gramStart"/>
-      <w:r>
-        <w:t>say</w:t>
-      </w:r>
-      <w:proofErr w:type="gramEnd"/>
-      <w:r>
-        <w:t xml:space="preserve"> "I'm trying to decide between X and Y," GRACE registers the decision mode. She runs you through a structured breakdown (Pros/Cons, risks).</w:t>
+        <w:t>When you say "I'm trying to decide between X and Y," GRACE registers the decision mode. She runs you through a structured breakdown (Pros/Cons, risks).</w:t>
       </w:r>
     </w:p>
     <w:p>
@@ -335,6 +361,7 @@
     </w:p>
     <w:p>
       <w:r>
+        <w:lastRenderedPageBreak/>
         <w:pict w14:anchorId="1D40A1C7">
           <v:rect id="_x0000_i1026" style="width:654pt;height:.75pt" o:hrpct="0" o:hralign="center" o:hrstd="t" o:hr="t" fillcolor="#a0a0a0" stroked="f"/>
         </w:pict>
@@ -352,7 +379,6 @@
           <w:b/>
           <w:bCs/>
         </w:rPr>
-        <w:lastRenderedPageBreak/>
         <w:t>5. Voice Mood &amp; Reflection Journal</w:t>
       </w:r>
     </w:p>
@@ -466,11 +492,6 @@
       </w:r>
     </w:p>
     <w:p/>
-    <w:p>
-      <w:r>
-        <w:t>GOOGLE MAPS INTEGRATION</w:t>
-      </w:r>
-    </w:p>
     <w:p/>
     <w:p/>
     <w:sectPr>

</xml_diff>

<commit_message>
implemeted MCP for fiel system
</commit_message>
<xml_diff>
--- a/Design Docs/Core Features Doc.docx
+++ b/Design Docs/Core Features Doc.docx
@@ -66,23 +66,7 @@
           <w:b/>
           <w:bCs/>
         </w:rPr>
-        <w:t xml:space="preserve">OS integration </w:t>
-      </w:r>
-      <w:proofErr w:type="spellStart"/>
-      <w:r>
-        <w:rPr>
-          <w:b/>
-          <w:bCs/>
-        </w:rPr>
-        <w:t>websites+apps</w:t>
-      </w:r>
-      <w:proofErr w:type="spellEnd"/>
-      <w:r>
-        <w:rPr>
-          <w:b/>
-          <w:bCs/>
-        </w:rPr>
-        <w:t xml:space="preserve"> and stuf</w:t>
+        <w:t>OS integration websites+apps and stuf</w:t>
       </w:r>
       <w:r>
         <w:rPr>
@@ -121,15 +105,7 @@
         </w:numPr>
       </w:pPr>
       <w:r>
-        <w:t xml:space="preserve">MAPS INTEGRATION (tom </w:t>
-      </w:r>
-      <w:proofErr w:type="spellStart"/>
-      <w:r>
-        <w:t>tom</w:t>
-      </w:r>
-      <w:proofErr w:type="spellEnd"/>
-      <w:r>
-        <w:t xml:space="preserve"> maps)</w:t>
+        <w:t>MAPS INTEGRATION (tom tom maps)</w:t>
       </w:r>
     </w:p>
     <w:p>
@@ -154,6 +130,26 @@
     </w:p>
     <w:p>
       <w:pPr>
+        <w:pStyle w:val="ListParagraph"/>
+        <w:numPr>
+          <w:ilvl w:val="0"/>
+          <w:numId w:val="7"/>
+        </w:numPr>
+        <w:rPr>
+          <w:b/>
+          <w:bCs/>
+        </w:rPr>
+      </w:pPr>
+      <w:r>
+        <w:rPr>
+          <w:b/>
+          <w:bCs/>
+        </w:rPr>
+        <w:t>MCP server intergrations</w:t>
+      </w:r>
+    </w:p>
+    <w:p>
+      <w:pPr>
         <w:rPr>
           <w:b/>
           <w:bCs/>
@@ -207,23 +203,7 @@
           <w:b/>
           <w:bCs/>
         </w:rPr>
-        <w:t>Database Schema (</w:t>
-      </w:r>
-      <w:proofErr w:type="spellStart"/>
-      <w:r>
-        <w:rPr>
-          <w:b/>
-          <w:bCs/>
-        </w:rPr>
-        <w:t>Grace_Decisions</w:t>
-      </w:r>
-      <w:proofErr w:type="spellEnd"/>
-      <w:r>
-        <w:rPr>
-          <w:b/>
-          <w:bCs/>
-        </w:rPr>
-        <w:t>):</w:t>
+        <w:t>Database Schema (Grace_Decisions):</w:t>
       </w:r>
     </w:p>
     <w:p>
@@ -233,13 +213,8 @@
           <w:numId w:val="5"/>
         </w:numPr>
       </w:pPr>
-      <w:proofErr w:type="spellStart"/>
-      <w:r>
-        <w:t>DecisionId</w:t>
-      </w:r>
-      <w:proofErr w:type="spellEnd"/>
-      <w:r>
-        <w:t> (UUID)</w:t>
+      <w:r>
+        <w:t>DecisionId (UUID)</w:t>
       </w:r>
     </w:p>
     <w:p>
@@ -261,15 +236,7 @@
         </w:numPr>
       </w:pPr>
       <w:r>
-        <w:t xml:space="preserve">Context (e.g., "Switching to Java Spring Boot over </w:t>
-      </w:r>
-      <w:proofErr w:type="spellStart"/>
-      <w:r>
-        <w:t>NestJS</w:t>
-      </w:r>
-      <w:proofErr w:type="spellEnd"/>
-      <w:r>
-        <w:t xml:space="preserve"> for project")</w:t>
+        <w:t>Context (e.g., "Switching to Java Spring Boot over NestJS for project")</w:t>
       </w:r>
     </w:p>
     <w:p>
@@ -290,13 +257,8 @@
           <w:numId w:val="5"/>
         </w:numPr>
       </w:pPr>
-      <w:proofErr w:type="spellStart"/>
-      <w:r>
-        <w:t>ChosenOption</w:t>
-      </w:r>
-      <w:proofErr w:type="spellEnd"/>
-      <w:r>
-        <w:t> (String)</w:t>
+      <w:r>
+        <w:t>ChosenOption (String)</w:t>
       </w:r>
     </w:p>
     <w:p>
@@ -306,13 +268,8 @@
           <w:numId w:val="5"/>
         </w:numPr>
       </w:pPr>
-      <w:proofErr w:type="spellStart"/>
-      <w:r>
-        <w:t>OutcomeReview</w:t>
-      </w:r>
-      <w:proofErr w:type="spellEnd"/>
-      <w:r>
-        <w:t> (Null initially, populated during follow-up reviews)</w:t>
+      <w:r>
+        <w:t>OutcomeReview (Null initially, populated during follow-up reviews)</w:t>
       </w:r>
     </w:p>
     <w:p>
@@ -360,12 +317,12 @@
         </w:numPr>
       </w:pPr>
       <w:r>
+        <w:lastRenderedPageBreak/>
         <w:t>When a similar decision arises in the future, GRACE scans the database to surface relevant notes.</w:t>
       </w:r>
     </w:p>
     <w:p>
       <w:r>
-        <w:lastRenderedPageBreak/>
         <w:pict w14:anchorId="1D40A1C7">
           <v:rect id="_x0000_i1026" style="width:654pt;height:.75pt" o:hrpct="0" o:hralign="center" o:hrstd="t" o:hr="t" fillcolor="#a0a0a0" stroked="f"/>
         </w:pict>
@@ -484,15 +441,7 @@
         </w:numPr>
       </w:pPr>
       <w:r>
-        <w:t>Save to a </w:t>
-      </w:r>
-      <w:proofErr w:type="spellStart"/>
-      <w:r>
-        <w:t>Grace_Reflections</w:t>
-      </w:r>
-      <w:proofErr w:type="spellEnd"/>
-      <w:r>
-        <w:t> table.</w:t>
+        <w:t>Save to a Grace_Reflections table.</w:t>
       </w:r>
     </w:p>
     <w:p/>

</xml_diff>

<commit_message>
feat: implement backend logging, messaging infrastructure, and GUI custom component library
</commit_message>
<xml_diff>
--- a/Design Docs/Core Features Doc.docx
+++ b/Design Docs/Core Features Doc.docx
@@ -66,7 +66,23 @@
           <w:b/>
           <w:bCs/>
         </w:rPr>
-        <w:t>OS integration websites+apps and stuf</w:t>
+        <w:t xml:space="preserve">OS integration </w:t>
+      </w:r>
+      <w:proofErr w:type="spellStart"/>
+      <w:r>
+        <w:rPr>
+          <w:b/>
+          <w:bCs/>
+        </w:rPr>
+        <w:t>websites+apps</w:t>
+      </w:r>
+      <w:proofErr w:type="spellEnd"/>
+      <w:r>
+        <w:rPr>
+          <w:b/>
+          <w:bCs/>
+        </w:rPr>
+        <w:t xml:space="preserve"> and stuf</w:t>
       </w:r>
       <w:r>
         <w:rPr>
@@ -105,7 +121,15 @@
         </w:numPr>
       </w:pPr>
       <w:r>
-        <w:t>MAPS INTEGRATION (tom tom maps)</w:t>
+        <w:t xml:space="preserve">MAPS INTEGRATION (tom </w:t>
+      </w:r>
+      <w:proofErr w:type="spellStart"/>
+      <w:r>
+        <w:t>tom</w:t>
+      </w:r>
+      <w:proofErr w:type="spellEnd"/>
+      <w:r>
+        <w:t xml:space="preserve"> maps)</w:t>
       </w:r>
     </w:p>
     <w:p>
@@ -125,7 +149,23 @@
           <w:b/>
           <w:bCs/>
         </w:rPr>
-        <w:t xml:space="preserve">Discord logger </w:t>
+        <w:t xml:space="preserve">Discord </w:t>
+      </w:r>
+      <w:proofErr w:type="gramStart"/>
+      <w:r>
+        <w:rPr>
+          <w:b/>
+          <w:bCs/>
+        </w:rPr>
+        <w:t>logger</w:t>
+      </w:r>
+      <w:proofErr w:type="gramEnd"/>
+      <w:r>
+        <w:rPr>
+          <w:b/>
+          <w:bCs/>
+        </w:rPr>
+        <w:t xml:space="preserve"> </w:t>
       </w:r>
     </w:p>
     <w:p>
@@ -145,8 +185,17 @@
           <w:b/>
           <w:bCs/>
         </w:rPr>
-        <w:t>MCP server intergrations</w:t>
+        <w:t xml:space="preserve">MCP server </w:t>
       </w:r>
+      <w:proofErr w:type="spellStart"/>
+      <w:r>
+        <w:rPr>
+          <w:b/>
+          <w:bCs/>
+        </w:rPr>
+        <w:t>intergrations</w:t>
+      </w:r>
+      <w:proofErr w:type="spellEnd"/>
     </w:p>
     <w:p>
       <w:pPr>
@@ -171,280 +220,6 @@
         </w:rPr>
       </w:pPr>
     </w:p>
-    <w:p>
-      <w:pPr>
-        <w:rPr>
-          <w:b/>
-          <w:bCs/>
-        </w:rPr>
-      </w:pPr>
-      <w:r>
-        <w:rPr>
-          <w:b/>
-          <w:bCs/>
-        </w:rPr>
-        <w:t>4. Decision Logging</w:t>
-      </w:r>
-    </w:p>
-    <w:p>
-      <w:r>
-        <w:t>GRACE will help you record, analyze, and review major life or career decisions to prevent choice paralysis and learn from historical choices.</w:t>
-      </w:r>
-    </w:p>
-    <w:p>
-      <w:pPr>
-        <w:numPr>
-          <w:ilvl w:val="0"/>
-          <w:numId w:val="5"/>
-        </w:numPr>
-      </w:pPr>
-      <w:r>
-        <w:rPr>
-          <w:b/>
-          <w:bCs/>
-        </w:rPr>
-        <w:t>Database Schema (Grace_Decisions):</w:t>
-      </w:r>
-    </w:p>
-    <w:p>
-      <w:pPr>
-        <w:numPr>
-          <w:ilvl w:val="1"/>
-          <w:numId w:val="5"/>
-        </w:numPr>
-      </w:pPr>
-      <w:r>
-        <w:t>DecisionId (UUID)</w:t>
-      </w:r>
-    </w:p>
-    <w:p>
-      <w:pPr>
-        <w:numPr>
-          <w:ilvl w:val="1"/>
-          <w:numId w:val="5"/>
-        </w:numPr>
-      </w:pPr>
-      <w:r>
-        <w:t>Timestamp (ISO Date)</w:t>
-      </w:r>
-    </w:p>
-    <w:p>
-      <w:pPr>
-        <w:numPr>
-          <w:ilvl w:val="1"/>
-          <w:numId w:val="5"/>
-        </w:numPr>
-      </w:pPr>
-      <w:r>
-        <w:t>Context (e.g., "Switching to Java Spring Boot over NestJS for project")</w:t>
-      </w:r>
-    </w:p>
-    <w:p>
-      <w:pPr>
-        <w:numPr>
-          <w:ilvl w:val="1"/>
-          <w:numId w:val="5"/>
-        </w:numPr>
-      </w:pPr>
-      <w:r>
-        <w:t>Options (List of options analyzed)</w:t>
-      </w:r>
-    </w:p>
-    <w:p>
-      <w:pPr>
-        <w:numPr>
-          <w:ilvl w:val="1"/>
-          <w:numId w:val="5"/>
-        </w:numPr>
-      </w:pPr>
-      <w:r>
-        <w:t>ChosenOption (String)</w:t>
-      </w:r>
-    </w:p>
-    <w:p>
-      <w:pPr>
-        <w:numPr>
-          <w:ilvl w:val="1"/>
-          <w:numId w:val="5"/>
-        </w:numPr>
-      </w:pPr>
-      <w:r>
-        <w:t>OutcomeReview (Null initially, populated during follow-up reviews)</w:t>
-      </w:r>
-    </w:p>
-    <w:p>
-      <w:pPr>
-        <w:numPr>
-          <w:ilvl w:val="0"/>
-          <w:numId w:val="5"/>
-        </w:numPr>
-      </w:pPr>
-      <w:r>
-        <w:rPr>
-          <w:b/>
-          <w:bCs/>
-        </w:rPr>
-        <w:t>Behavior Pattern:</w:t>
-      </w:r>
-    </w:p>
-    <w:p>
-      <w:pPr>
-        <w:numPr>
-          <w:ilvl w:val="1"/>
-          <w:numId w:val="5"/>
-        </w:numPr>
-      </w:pPr>
-      <w:r>
-        <w:t>When you say "I'm trying to decide between X and Y," GRACE registers the decision mode. She runs you through a structured breakdown (Pros/Cons, risks).</w:t>
-      </w:r>
-    </w:p>
-    <w:p>
-      <w:pPr>
-        <w:numPr>
-          <w:ilvl w:val="1"/>
-          <w:numId w:val="5"/>
-        </w:numPr>
-      </w:pPr>
-      <w:r>
-        <w:t>Once you make a choice, she updates the record.</w:t>
-      </w:r>
-    </w:p>
-    <w:p>
-      <w:pPr>
-        <w:numPr>
-          <w:ilvl w:val="1"/>
-          <w:numId w:val="5"/>
-        </w:numPr>
-      </w:pPr>
-      <w:r>
-        <w:lastRenderedPageBreak/>
-        <w:t>When a similar decision arises in the future, GRACE scans the database to surface relevant notes.</w:t>
-      </w:r>
-    </w:p>
-    <w:p>
-      <w:r>
-        <w:pict w14:anchorId="1D40A1C7">
-          <v:rect id="_x0000_i1026" style="width:654pt;height:.75pt" o:hrpct="0" o:hralign="center" o:hrstd="t" o:hr="t" fillcolor="#a0a0a0" stroked="f"/>
-        </w:pict>
-      </w:r>
-    </w:p>
-    <w:p>
-      <w:pPr>
-        <w:rPr>
-          <w:b/>
-          <w:bCs/>
-        </w:rPr>
-      </w:pPr>
-      <w:r>
-        <w:rPr>
-          <w:b/>
-          <w:bCs/>
-        </w:rPr>
-        <w:t>5. Voice Mood &amp; Reflection Journal</w:t>
-      </w:r>
-    </w:p>
-    <w:p>
-      <w:r>
-        <w:t>A voice-based journaling pipeline designed to recognize emotional patterns, help manage anxiety, and catch repetitive negative thinking loops.</w:t>
-      </w:r>
-    </w:p>
-    <w:p>
-      <w:pPr>
-        <w:numPr>
-          <w:ilvl w:val="0"/>
-          <w:numId w:val="6"/>
-        </w:numPr>
-      </w:pPr>
-      <w:r>
-        <w:rPr>
-          <w:b/>
-          <w:bCs/>
-        </w:rPr>
-        <w:t>User Experience:</w:t>
-      </w:r>
-    </w:p>
-    <w:p>
-      <w:pPr>
-        <w:numPr>
-          <w:ilvl w:val="1"/>
-          <w:numId w:val="6"/>
-        </w:numPr>
-      </w:pPr>
-      <w:r>
-        <w:t>You trigger journaling: "Grace, let's journal."</w:t>
-      </w:r>
-    </w:p>
-    <w:p>
-      <w:pPr>
-        <w:numPr>
-          <w:ilvl w:val="1"/>
-          <w:numId w:val="6"/>
-        </w:numPr>
-      </w:pPr>
-      <w:r>
-        <w:t>GRACE switches to a continuous VAD mode with visual cues on the HUD, prompting you to talk about your day, frustrations, or plans.</w:t>
-      </w:r>
-    </w:p>
-    <w:p>
-      <w:pPr>
-        <w:numPr>
-          <w:ilvl w:val="1"/>
-          <w:numId w:val="6"/>
-        </w:numPr>
-      </w:pPr>
-      <w:r>
-        <w:t>When you finish, GRACE transcribes the input and performs analysis.</w:t>
-      </w:r>
-    </w:p>
-    <w:p>
-      <w:pPr>
-        <w:numPr>
-          <w:ilvl w:val="0"/>
-          <w:numId w:val="6"/>
-        </w:numPr>
-      </w:pPr>
-      <w:r>
-        <w:rPr>
-          <w:b/>
-          <w:bCs/>
-        </w:rPr>
-        <w:t>Analysis &amp; Sentiment Tagging:</w:t>
-      </w:r>
-    </w:p>
-    <w:p>
-      <w:pPr>
-        <w:numPr>
-          <w:ilvl w:val="1"/>
-          <w:numId w:val="6"/>
-        </w:numPr>
-      </w:pPr>
-      <w:r>
-        <w:t>Calculate sentiment polarity (Positive, Neutral, Anxious, Frustrated).</w:t>
-      </w:r>
-    </w:p>
-    <w:p>
-      <w:pPr>
-        <w:numPr>
-          <w:ilvl w:val="1"/>
-          <w:numId w:val="6"/>
-        </w:numPr>
-      </w:pPr>
-      <w:r>
-        <w:t>Extract core keywords (e.g., "TCS", "Career transition", "Anxiety").</w:t>
-      </w:r>
-    </w:p>
-    <w:p>
-      <w:pPr>
-        <w:numPr>
-          <w:ilvl w:val="1"/>
-          <w:numId w:val="6"/>
-        </w:numPr>
-      </w:pPr>
-      <w:r>
-        <w:t>Save to a Grace_Reflections table.</w:t>
-      </w:r>
-    </w:p>
-    <w:p/>
     <w:p/>
     <w:p/>
     <w:sectPr>

</xml_diff>

<commit_message>
feat: implement long-term memory indexer and add tool usage documentation
</commit_message>
<xml_diff>
--- a/Design Docs/Core Features Doc.docx
+++ b/Design Docs/Core Features Doc.docx
@@ -66,23 +66,7 @@
           <w:b/>
           <w:bCs/>
         </w:rPr>
-        <w:t xml:space="preserve">OS integration </w:t>
-      </w:r>
-      <w:proofErr w:type="spellStart"/>
-      <w:r>
-        <w:rPr>
-          <w:b/>
-          <w:bCs/>
-        </w:rPr>
-        <w:t>websites+apps</w:t>
-      </w:r>
-      <w:proofErr w:type="spellEnd"/>
-      <w:r>
-        <w:rPr>
-          <w:b/>
-          <w:bCs/>
-        </w:rPr>
-        <w:t xml:space="preserve"> and stuf</w:t>
+        <w:t>OS integration websites+apps and stuf</w:t>
       </w:r>
       <w:r>
         <w:rPr>
@@ -121,15 +105,7 @@
         </w:numPr>
       </w:pPr>
       <w:r>
-        <w:t xml:space="preserve">MAPS INTEGRATION (tom </w:t>
-      </w:r>
-      <w:proofErr w:type="spellStart"/>
-      <w:r>
-        <w:t>tom</w:t>
-      </w:r>
-      <w:proofErr w:type="spellEnd"/>
-      <w:r>
-        <w:t xml:space="preserve"> maps)</w:t>
+        <w:t>MAPS INTEGRATION (tom tom maps)</w:t>
       </w:r>
     </w:p>
     <w:p>
@@ -149,23 +125,7 @@
           <w:b/>
           <w:bCs/>
         </w:rPr>
-        <w:t xml:space="preserve">Discord </w:t>
-      </w:r>
-      <w:proofErr w:type="gramStart"/>
-      <w:r>
-        <w:rPr>
-          <w:b/>
-          <w:bCs/>
-        </w:rPr>
-        <w:t>logger</w:t>
-      </w:r>
-      <w:proofErr w:type="gramEnd"/>
-      <w:r>
-        <w:rPr>
-          <w:b/>
-          <w:bCs/>
-        </w:rPr>
-        <w:t xml:space="preserve"> </w:t>
+        <w:t xml:space="preserve">Discord logger </w:t>
       </w:r>
     </w:p>
     <w:p>
@@ -185,17 +145,66 @@
           <w:b/>
           <w:bCs/>
         </w:rPr>
-        <w:t xml:space="preserve">MCP server </w:t>
+        <w:t>Calender service</w:t>
       </w:r>
-      <w:proofErr w:type="spellStart"/>
+    </w:p>
+    <w:p>
+      <w:pPr>
+        <w:pStyle w:val="ListParagraph"/>
+        <w:numPr>
+          <w:ilvl w:val="0"/>
+          <w:numId w:val="7"/>
+        </w:numPr>
+        <w:rPr>
+          <w:b/>
+          <w:bCs/>
+        </w:rPr>
+      </w:pPr>
       <w:r>
         <w:rPr>
           <w:b/>
           <w:bCs/>
         </w:rPr>
-        <w:t>intergrations</w:t>
+        <w:t>MCP server intergrations</w:t>
       </w:r>
-      <w:proofErr w:type="spellEnd"/>
+      <w:r>
+        <w:rPr>
+          <w:b/>
+          <w:bCs/>
+        </w:rPr>
+        <w:t>(file system+palyright)</w:t>
+      </w:r>
+    </w:p>
+    <w:p>
+      <w:pPr>
+        <w:rPr>
+          <w:b/>
+          <w:bCs/>
+        </w:rPr>
+      </w:pPr>
+    </w:p>
+    <w:p>
+      <w:pPr>
+        <w:rPr>
+          <w:b/>
+          <w:bCs/>
+        </w:rPr>
+      </w:pPr>
+      <w:r>
+        <w:rPr>
+          <w:b/>
+          <w:bCs/>
+        </w:rPr>
+        <w:t>Playwright MCP</w:t>
+      </w:r>
+    </w:p>
+    <w:p>
+      <w:pPr>
+        <w:rPr>
+          <w:b/>
+          <w:bCs/>
+        </w:rPr>
+      </w:pPr>
     </w:p>
     <w:p>
       <w:pPr>

</xml_diff>